<commit_message>
Stage 6, round 1: figure check findings and fixes (Figure 3 legend dollars, header face, tagged PDF, Figure 4 source line); rebuild v19
Co-Authored-By: Claude Opus 5.5 <noreply@anthropic.com>
Claude-Session: https://claude.ai/code/session_01QjR1ATdPEGjztyk2XXvQC1
</commit_message>
<xml_diff>
--- a/review/Exposure-Not-Loss-v19-draft.docx
+++ b/review/Exposure-Not-Loss-v19-draft.docx
@@ -2775,7 +2775,7 @@
       <w:r>
         <w:drawing>
           <wp:inline>
-            <wp:extent cx="5943600" cy="5713285"/>
+            <wp:extent cx="5943600" cy="5804916"/>
             <wp:effectExtent b="0" l="0" r="0" t="0"/>
             <wp:docPr descr="Tile map of the 50 states and DC sorted into five groups: 24 states where both rules reach (A), 2 where the cap and a lower threshold on non-hospital taxes reach (B), 3 cap only (C), 8 non-expansion states with SDPs above the caps (D) and 14 with no identified hospital SDPs above the caps (E), five of which the lower threshold reaches; it shows where the rules apply, not where losses are largest." title="Figure 3" id="40" name="Figure 3"/>
             <a:graphic>
@@ -2796,7 +2796,7 @@
                   <pic:spPr bwMode="auto">
                     <a:xfrm>
                       <a:off x="0" y="0"/>
-                      <a:ext cx="5943600" cy="5713285"/>
+                      <a:ext cx="5943600" cy="5804916"/>
                     </a:xfrm>
                     <a:prstGeom prst="rect">
                       <a:avLst/>
@@ -5363,20 +5363,20 @@
     </w:pPr>
     <w:r>
       <w:rPr>
-        <w:rFonts w:ascii="Gelasio" w:hAnsi="Gelasio" w:eastAsia="Gelasio" w:cs="Gelasio"/>
+        <w:rFonts w:ascii="EB Garamond" w:hAnsi="EB Garamond" w:eastAsia="EB Garamond" w:cs="EB Garamond"/>
         <w:b/>
         <w:color w:val="A10400"/>
-        <w:sz w:val="20"/>
-        <w:szCs w:val="20"/>
+        <w:sz w:val="21"/>
+        <w:szCs w:val="21"/>
       </w:rPr>
       <w:t>THEIA</w:t>
     </w:r>
     <w:r>
       <w:rPr>
-        <w:rFonts w:ascii="Gelasio" w:hAnsi="Gelasio" w:eastAsia="Gelasio" w:cs="Gelasio"/>
+        <w:rFonts w:ascii="EB Garamond" w:hAnsi="EB Garamond" w:eastAsia="EB Garamond" w:cs="EB Garamond"/>
         <w:color w:val="A10400"/>
-        <w:sz w:val="20"/>
-        <w:szCs w:val="20"/>
+        <w:sz w:val="21"/>
+        <w:szCs w:val="21"/>
       </w:rPr>
       <w:t xml:space="preserve"> Services</w:t>
     </w:r>

</xml_diff>